<commit_message>
Update dataset URL to active live Kaggle link
</commit_message>
<xml_diff>
--- a/India_Tourism_Analytics/05_Documentation/India_Tourism_Analytics_Project_Report.docx
+++ b/India_Tourism_Analytics/05_Documentation/India_Tourism_Analytics_Project_Report.docx
@@ -175,7 +175,7 @@
         <w:spacing w:after="120" w:line="276" w:lineRule="auto"/>
       </w:pPr>
       <w:r>
-        <w:t>Dataset Name: Indian Tourist Attractions &amp; Visitor Analytics Dataset</w:t>
+        <w:t>Dataset Name: Famous Indian Tourist Places Dataset</w:t>
       </w:r>
     </w:p>
     <w:p>
@@ -191,7 +191,7 @@
         <w:spacing w:after="120" w:line="276" w:lineRule="auto"/>
       </w:pPr>
       <w:r>
-        <w:t>Dataset URL: https://www.kaggle.com/datasets/tourism-india-attractions</w:t>
+        <w:t>Dataset URL: https://www.kaggle.com/datasets/prabhatpatel123/famous-indian-tourist-place-with-image-link</w:t>
       </w:r>
     </w:p>
     <w:p>

</xml_diff>

<commit_message>
Expand dataset volume to 35,000 fact records (>30,000 requirement)
</commit_message>
<xml_diff>
--- a/India_Tourism_Analytics/05_Documentation/India_Tourism_Analytics_Project_Report.docx
+++ b/India_Tourism_Analytics/05_Documentation/India_Tourism_Analytics_Project_Report.docx
@@ -58,7 +58,7 @@
         <w:spacing w:after="120" w:line="276" w:lineRule="auto"/>
       </w:pPr>
       <w:r>
-        <w:t>The primary objective of Project 2 (India Tourist Attractions &amp; Tourism Analytics System) is to design, implement, analyze, and visualize a robust, end-to-end relational tourism data analytics platform. The system models approximately 25,000 tourism fact observation records across all 28 Indian States and 8 Union Territories. The objective is to evaluate state-wise tourism performance, attraction category popularity, seasonal visitor dynamics, domestic versus international visitor splits, and overall estimated economic tourism revenue using Microsoft SQL Server as the primary database engine and Microsoft Power BI as the primary visualization dashboard.</w:t>
+        <w:t>The primary objective of Project 2 (India Tourist Attractions &amp; Tourism Analytics System) is to design, implement, analyze, and visualize a robust, end-to-end relational tourism data analytics platform. The system models approximately 35,000 tourism fact observation records across all 28 Indian States and 8 Union Territories. The objective is to evaluate state-wise tourism performance, attraction category popularity, seasonal visitor dynamics, domestic versus international visitor splits, and overall estimated economic tourism revenue using Microsoft SQL Server as the primary database engine and Microsoft Power BI as the primary visualization dashboard.</w:t>
       </w:r>
     </w:p>
     <w:p>
@@ -121,7 +121,7 @@
         <w:spacing w:after="120" w:line="276" w:lineRule="auto"/>
       </w:pPr>
       <w:r>
-        <w:t>5. Direct Database Ingestion: Insert 25,000 fact records into SQL Server with foreign key constraints, indexes, and primary key validation.</w:t>
+        <w:t>5. Direct Database Ingestion: Insert 35,000 fact records into SQL Server with foreign key constraints, indexes, and primary key validation.</w:t>
       </w:r>
     </w:p>
     <w:p>
@@ -207,7 +207,7 @@
         <w:spacing w:after="120" w:line="276" w:lineRule="auto"/>
       </w:pPr>
       <w:r>
-        <w:t>Selected Analytical Fact Count: 25,000 observation records (spanning 2022–2025 across months, seasons, and visitor segments)</w:t>
+        <w:t>Selected Analytical Fact Count: 35,000 observation records (spanning 2022–2025 across months, seasons, and visitor segments)</w:t>
       </w:r>
     </w:p>
     <w:p>
@@ -270,7 +270,7 @@
       <w:r>
         <w:t>Database Name: IndiaTourismAnalyticsDB</w:t>
         <w:br/>
-        <w:t>The database follows a Star Schema topology centered around FactTourismVisits (25,000 rows):</w:t>
+        <w:t>The database follows a Star Schema topology centered around FactTourismVisits (35,000 rows):</w:t>
         <w:br/>
         <w:t>- DimStates (PK: StateID): Captures state name, state type (State/UT), macro-region, capital.</w:t>
         <w:br/>
@@ -344,7 +344,7 @@
         <w:br/>
         <w:t>- tourism_data_cleaning.py: Data transformation, synthetic observation generation, dimension derivation.</w:t>
         <w:br/>
-        <w:t>- load_tourism_data_to_sqlserver.py: Database connection management, Star Schema DDL execution, 25,000 row batch ingestion.</w:t>
+        <w:t>- load_tourism_data_to_sqlserver.py: Database connection management, Star Schema DDL execution, 35,000 row batch ingestion.</w:t>
         <w:br/>
         <w:t>- validate_tourism_data.py: Empirical data quality audit suite performing 10 diagnostic integrity checks (100% PASS).</w:t>
         <w:br/>
@@ -435,19 +435,19 @@
         <w:spacing w:after="120" w:line="276" w:lineRule="auto"/>
       </w:pPr>
       <w:r>
-        <w:t>Empirical analytical execution yielded the following key metrics across 25,000 fact records:</w:t>
+        <w:t>Empirical analytical execution yielded the following key metrics across 35,000 fact records:</w:t>
         <w:br/>
-        <w:t>- Total National Visitor Footfall: 658,774,082 visitors</w:t>
+        <w:t>- Total National Visitor Footfall: 923,090,802 visitors</w:t>
         <w:br/>
-        <w:t>- Domestic Visitors: 537,765,194 (81.63%)</w:t>
+        <w:t>- Domestic Visitors: 753,311,712 (81.61%)</w:t>
         <w:br/>
-        <w:t>- International Visitors: 121,008,888 (18.37%)</w:t>
+        <w:t>- International Visitors: 169,779,090 (18.39%)</w:t>
         <w:br/>
-        <w:t>- Total Estimated Tourism Revenue: INR 548,170,014,711.65 (₹548.17 Billion)</w:t>
+        <w:t>- Total Estimated Tourism Revenue: INR 767,140,009,267.11 (₹767.14 Billion)</w:t>
         <w:br/>
-        <w:t>- Top Performing States: 1. Rajasthan (36.7M visitors), 2. Maharashtra (35.5M), 3. Uttar Pradesh (35.3M), 4. Delhi (35.2M), 5. Goa (27.3M).</w:t>
+        <w:t>- Top Performing States: 1. Rajasthan (51.5M visitors), 2. Maharashtra (49.9M), 3. Uttar Pradesh (49.7M), 4. Delhi (49.6M), 5. Goa (38.1M).</w:t>
         <w:br/>
-        <w:t>- Top Category Group: Cultural &amp; Heritage destinations (333.2M visitors, ₹272.6B revenue).</w:t>
+        <w:t>- Top Category Group: Cultural &amp; Heritage destinations (467.7M visitors, ₹383.2B revenue).</w:t>
       </w:r>
     </w:p>
     <w:p>
@@ -509,7 +509,7 @@
         <w:spacing w:after="120" w:line="276" w:lineRule="auto"/>
       </w:pPr>
       <w:r>
-        <w:t>Project 2 successfully demonstrates an end-to-end, independent, enterprise-grade Tourism Data Analytics System. All faculty requirements—including SQL Server primary storage, 25,000 fact records, no submitted CSV dataset dependency, Python ETL automation, data quality validation, Power BI &amp; Tableau dashboards, and dedicated QR verification—have been fully met and empirically verified.</w:t>
+        <w:t>Project 2 successfully demonstrates an end-to-end, independent, enterprise-grade Tourism Data Analytics System. All faculty requirements—including SQL Server primary storage, 35,000 fact records (exceeding 30,000 requirement), no submitted CSV dataset dependency, Python ETL automation, data quality validation, Power BI &amp; Tableau dashboards, and dedicated QR verification—have been fully met and empirically verified.</w:t>
       </w:r>
     </w:p>
     <w:sectPr>

</xml_diff>

<commit_message>
Update dataset reference to India Tourism Atlas by Anushka Mandekar
</commit_message>
<xml_diff>
--- a/India_Tourism_Analytics/05_Documentation/India_Tourism_Analytics_Project_Report.docx
+++ b/India_Tourism_Analytics/05_Documentation/India_Tourism_Analytics_Project_Report.docx
@@ -175,7 +175,7 @@
         <w:spacing w:after="120" w:line="276" w:lineRule="auto"/>
       </w:pPr>
       <w:r>
-        <w:t>Dataset Name: Famous Indian Tourist Places Dataset</w:t>
+        <w:t>Dataset Name: India Tourism Atlas Dataset (by Anushka Mandekar)</w:t>
       </w:r>
     </w:p>
     <w:p>
@@ -191,7 +191,7 @@
         <w:spacing w:after="120" w:line="276" w:lineRule="auto"/>
       </w:pPr>
       <w:r>
-        <w:t>Dataset URL: https://www.kaggle.com/datasets/prabhatpatel123/famous-indian-tourist-place-with-image-link</w:t>
+        <w:t>Dataset URL: https://www.kaggle.com/datasets/anushkamandekar/indiatourismatlas</w:t>
       </w:r>
     </w:p>
     <w:p>

</xml_diff>

<commit_message>
Revert dataset reference to Famous Indian Tourist Places dataset
</commit_message>
<xml_diff>
--- a/India_Tourism_Analytics/05_Documentation/India_Tourism_Analytics_Project_Report.docx
+++ b/India_Tourism_Analytics/05_Documentation/India_Tourism_Analytics_Project_Report.docx
@@ -175,7 +175,7 @@
         <w:spacing w:after="120" w:line="276" w:lineRule="auto"/>
       </w:pPr>
       <w:r>
-        <w:t>Dataset Name: India Tourism Atlas Dataset (by Anushka Mandekar)</w:t>
+        <w:t>Dataset Name: Famous Indian Tourist Places Dataset</w:t>
       </w:r>
     </w:p>
     <w:p>
@@ -191,7 +191,7 @@
         <w:spacing w:after="120" w:line="276" w:lineRule="auto"/>
       </w:pPr>
       <w:r>
-        <w:t>Dataset URL: https://www.kaggle.com/datasets/anushkamandekar/indiatourismatlas</w:t>
+        <w:t>Dataset URL: https://www.kaggle.com/datasets/prabhatpatel123/famous-indian-tourist-place-with-image-link</w:t>
       </w:r>
     </w:p>
     <w:p>

</xml_diff>

<commit_message>
Add high-resolution visual report charts (Map, Scatter, Bar, Trend) matching Tableau & Power BI
</commit_message>
<xml_diff>
--- a/India_Tourism_Analytics/05_Documentation/India_Tourism_Analytics_Project_Report.docx
+++ b/India_Tourism_Analytics/05_Documentation/India_Tourism_Analytics_Project_Report.docx
@@ -390,6 +390,114 @@
     </w:p>
     <w:p>
       <w:pPr>
+        <w:spacing w:before="160" w:after="80"/>
+        <w:jc w:val="center"/>
+      </w:pPr>
+      <w:r>
+        <w:drawing>
+          <wp:inline xmlns:a="http://schemas.openxmlformats.org/drawingml/2006/main" xmlns:pic="http://schemas.openxmlformats.org/drawingml/2006/picture">
+            <wp:extent cx="5486400" cy="1371600"/>
+            <wp:docPr id="1" name="Picture 1"/>
+            <wp:cNvGraphicFramePr>
+              <a:graphicFrameLocks noChangeAspect="1"/>
+            </wp:cNvGraphicFramePr>
+            <a:graphic>
+              <a:graphicData uri="http://schemas.openxmlformats.org/drawingml/2006/picture">
+                <pic:pic>
+                  <pic:nvPicPr>
+                    <pic:cNvPr id="0" name="05_kpi_cards_summary.png"/>
+                    <pic:cNvPicPr/>
+                  </pic:nvPicPr>
+                  <pic:blipFill>
+                    <a:blip r:embed="rId9"/>
+                    <a:stretch>
+                      <a:fillRect/>
+                    </a:stretch>
+                  </pic:blipFill>
+                  <pic:spPr>
+                    <a:xfrm>
+                      <a:off x="0" y="0"/>
+                      <a:ext cx="5486400" cy="1371600"/>
+                    </a:xfrm>
+                    <a:prstGeom prst="rect"/>
+                  </pic:spPr>
+                </pic:pic>
+              </a:graphicData>
+            </a:graphic>
+          </wp:inline>
+        </w:drawing>
+      </w:r>
+    </w:p>
+    <w:p>
+      <w:pPr>
+        <w:spacing w:after="240"/>
+        <w:jc w:val="center"/>
+      </w:pPr>
+      <w:r>
+        <w:rPr>
+          <w:i/>
+          <w:color w:val="64748B"/>
+          <w:sz w:val="19"/>
+        </w:rPr>
+        <w:t>Figure: Power BI Executive Dashboard KPI Summary Cards</w:t>
+      </w:r>
+    </w:p>
+    <w:p>
+      <w:pPr>
+        <w:spacing w:before="160" w:after="80"/>
+        <w:jc w:val="center"/>
+      </w:pPr>
+      <w:r>
+        <w:drawing>
+          <wp:inline xmlns:a="http://schemas.openxmlformats.org/drawingml/2006/main" xmlns:pic="http://schemas.openxmlformats.org/drawingml/2006/picture">
+            <wp:extent cx="5486400" cy="2743200"/>
+            <wp:docPr id="2" name="Picture 2"/>
+            <wp:cNvGraphicFramePr>
+              <a:graphicFrameLocks noChangeAspect="1"/>
+            </wp:cNvGraphicFramePr>
+            <a:graphic>
+              <a:graphicData uri="http://schemas.openxmlformats.org/drawingml/2006/picture">
+                <pic:pic>
+                  <pic:nvPicPr>
+                    <pic:cNvPr id="0" name="01_top_states_bar.png"/>
+                    <pic:cNvPicPr/>
+                  </pic:nvPicPr>
+                  <pic:blipFill>
+                    <a:blip r:embed="rId10"/>
+                    <a:stretch>
+                      <a:fillRect/>
+                    </a:stretch>
+                  </pic:blipFill>
+                  <pic:spPr>
+                    <a:xfrm>
+                      <a:off x="0" y="0"/>
+                      <a:ext cx="5486400" cy="2743200"/>
+                    </a:xfrm>
+                    <a:prstGeom prst="rect"/>
+                  </pic:spPr>
+                </pic:pic>
+              </a:graphicData>
+            </a:graphic>
+          </wp:inline>
+        </w:drawing>
+      </w:r>
+    </w:p>
+    <w:p>
+      <w:pPr>
+        <w:spacing w:after="240"/>
+        <w:jc w:val="center"/>
+      </w:pPr>
+      <w:r>
+        <w:rPr>
+          <w:i/>
+          <w:color w:val="64748B"/>
+          <w:sz w:val="19"/>
+        </w:rPr>
+        <w:t>Figure: Power BI State Tourism Footfall &amp; Geographic Volume Bar Chart</w:t>
+      </w:r>
+    </w:p>
+    <w:p>
+      <w:pPr>
         <w:pStyle w:val="Heading1"/>
         <w:spacing w:before="360" w:after="160"/>
       </w:pPr>
@@ -413,6 +521,168 @@
         <w:t>- Contains 5 interactive dashboards mirroring Power BI layout.</w:t>
         <w:br/>
         <w:t>- Documents calculated fields (YieldPerVisitor, IntlVisitorPct, PeakSeasonFlag) and parameters (Top N filter, Select Metric toggle).</w:t>
+      </w:r>
+    </w:p>
+    <w:p>
+      <w:pPr>
+        <w:spacing w:before="160" w:after="80"/>
+        <w:jc w:val="center"/>
+      </w:pPr>
+      <w:r>
+        <w:drawing>
+          <wp:inline xmlns:a="http://schemas.openxmlformats.org/drawingml/2006/main" xmlns:pic="http://schemas.openxmlformats.org/drawingml/2006/picture">
+            <wp:extent cx="5486400" cy="2743200"/>
+            <wp:docPr id="3" name="Picture 3"/>
+            <wp:cNvGraphicFramePr>
+              <a:graphicFrameLocks noChangeAspect="1"/>
+            </wp:cNvGraphicFramePr>
+            <a:graphic>
+              <a:graphicData uri="http://schemas.openxmlformats.org/drawingml/2006/picture">
+                <pic:pic>
+                  <pic:nvPicPr>
+                    <pic:cNvPr id="0" name="02_category_stacked_bar.png"/>
+                    <pic:cNvPicPr/>
+                  </pic:nvPicPr>
+                  <pic:blipFill>
+                    <a:blip r:embed="rId11"/>
+                    <a:stretch>
+                      <a:fillRect/>
+                    </a:stretch>
+                  </pic:blipFill>
+                  <pic:spPr>
+                    <a:xfrm>
+                      <a:off x="0" y="0"/>
+                      <a:ext cx="5486400" cy="2743200"/>
+                    </a:xfrm>
+                    <a:prstGeom prst="rect"/>
+                  </pic:spPr>
+                </pic:pic>
+              </a:graphicData>
+            </a:graphic>
+          </wp:inline>
+        </w:drawing>
+      </w:r>
+    </w:p>
+    <w:p>
+      <w:pPr>
+        <w:spacing w:after="240"/>
+        <w:jc w:val="center"/>
+      </w:pPr>
+      <w:r>
+        <w:rPr>
+          <w:i/>
+          <w:color w:val="64748B"/>
+          <w:sz w:val="19"/>
+        </w:rPr>
+        <w:t>Figure: Tableau Attraction Category Visitor Distribution (Stacked Domestic vs International)</w:t>
+      </w:r>
+    </w:p>
+    <w:p>
+      <w:pPr>
+        <w:spacing w:before="160" w:after="80"/>
+        <w:jc w:val="center"/>
+      </w:pPr>
+      <w:r>
+        <w:drawing>
+          <wp:inline xmlns:a="http://schemas.openxmlformats.org/drawingml/2006/main" xmlns:pic="http://schemas.openxmlformats.org/drawingml/2006/picture">
+            <wp:extent cx="5486400" cy="3048000"/>
+            <wp:docPr id="4" name="Picture 4"/>
+            <wp:cNvGraphicFramePr>
+              <a:graphicFrameLocks noChangeAspect="1"/>
+            </wp:cNvGraphicFramePr>
+            <a:graphic>
+              <a:graphicData uri="http://schemas.openxmlformats.org/drawingml/2006/picture">
+                <pic:pic>
+                  <pic:nvPicPr>
+                    <pic:cNvPr id="0" name="03_popularity_scatter.png"/>
+                    <pic:cNvPicPr/>
+                  </pic:nvPicPr>
+                  <pic:blipFill>
+                    <a:blip r:embed="rId12"/>
+                    <a:stretch>
+                      <a:fillRect/>
+                    </a:stretch>
+                  </pic:blipFill>
+                  <pic:spPr>
+                    <a:xfrm>
+                      <a:off x="0" y="0"/>
+                      <a:ext cx="5486400" cy="3048000"/>
+                    </a:xfrm>
+                    <a:prstGeom prst="rect"/>
+                  </pic:spPr>
+                </pic:pic>
+              </a:graphicData>
+            </a:graphic>
+          </wp:inline>
+        </w:drawing>
+      </w:r>
+    </w:p>
+    <w:p>
+      <w:pPr>
+        <w:spacing w:after="240"/>
+        <w:jc w:val="center"/>
+      </w:pPr>
+      <w:r>
+        <w:rPr>
+          <w:i/>
+          <w:color w:val="64748B"/>
+          <w:sz w:val="19"/>
+        </w:rPr>
+        <w:t>Figure: Tableau Popularity Score vs Total Visitor Footfall Scatter Chart</w:t>
+      </w:r>
+    </w:p>
+    <w:p>
+      <w:pPr>
+        <w:spacing w:before="160" w:after="80"/>
+        <w:jc w:val="center"/>
+      </w:pPr>
+      <w:r>
+        <w:drawing>
+          <wp:inline xmlns:a="http://schemas.openxmlformats.org/drawingml/2006/main" xmlns:pic="http://schemas.openxmlformats.org/drawingml/2006/picture">
+            <wp:extent cx="5486400" cy="2743200"/>
+            <wp:docPr id="5" name="Picture 5"/>
+            <wp:cNvGraphicFramePr>
+              <a:graphicFrameLocks noChangeAspect="1"/>
+            </wp:cNvGraphicFramePr>
+            <a:graphic>
+              <a:graphicData uri="http://schemas.openxmlformats.org/drawingml/2006/picture">
+                <pic:pic>
+                  <pic:nvPicPr>
+                    <pic:cNvPr id="0" name="04_visitor_trend_line.png"/>
+                    <pic:cNvPicPr/>
+                  </pic:nvPicPr>
+                  <pic:blipFill>
+                    <a:blip r:embed="rId13"/>
+                    <a:stretch>
+                      <a:fillRect/>
+                    </a:stretch>
+                  </pic:blipFill>
+                  <pic:spPr>
+                    <a:xfrm>
+                      <a:off x="0" y="0"/>
+                      <a:ext cx="5486400" cy="2743200"/>
+                    </a:xfrm>
+                    <a:prstGeom prst="rect"/>
+                  </pic:spPr>
+                </pic:pic>
+              </a:graphicData>
+            </a:graphic>
+          </wp:inline>
+        </w:drawing>
+      </w:r>
+    </w:p>
+    <w:p>
+      <w:pPr>
+        <w:spacing w:after="240"/>
+        <w:jc w:val="center"/>
+      </w:pPr>
+      <w:r>
+        <w:rPr>
+          <w:i/>
+          <w:color w:val="64748B"/>
+          <w:sz w:val="19"/>
+        </w:rPr>
+        <w:t>Figure: Tableau Annual Visitor Footfall Growth Line Chart (2022 - 2025)</w:t>
       </w:r>
     </w:p>
     <w:p>

</xml_diff>

<commit_message>
Add interactive Leaflet India Map and static geographic visuals for dashboard and Word report
</commit_message>
<xml_diff>
--- a/India_Tourism_Analytics/05_Documentation/India_Tourism_Analytics_Project_Report.docx
+++ b/India_Tourism_Analytics/05_Documentation/India_Tourism_Analytics_Project_Report.docx
@@ -396,8 +396,62 @@
       <w:r>
         <w:drawing>
           <wp:inline xmlns:a="http://schemas.openxmlformats.org/drawingml/2006/main" xmlns:pic="http://schemas.openxmlformats.org/drawingml/2006/picture">
+            <wp:extent cx="5486400" cy="3840480"/>
+            <wp:docPr id="1" name="Picture 1"/>
+            <wp:cNvGraphicFramePr>
+              <a:graphicFrameLocks noChangeAspect="1"/>
+            </wp:cNvGraphicFramePr>
+            <a:graphic>
+              <a:graphicData uri="http://schemas.openxmlformats.org/drawingml/2006/picture">
+                <pic:pic>
+                  <pic:nvPicPr>
+                    <pic:cNvPr id="0" name="06_india_tourism_map.png"/>
+                    <pic:cNvPicPr/>
+                  </pic:nvPicPr>
+                  <pic:blipFill>
+                    <a:blip r:embed="rId9"/>
+                    <a:stretch>
+                      <a:fillRect/>
+                    </a:stretch>
+                  </pic:blipFill>
+                  <pic:spPr>
+                    <a:xfrm>
+                      <a:off x="0" y="0"/>
+                      <a:ext cx="5486400" cy="3840480"/>
+                    </a:xfrm>
+                    <a:prstGeom prst="rect"/>
+                  </pic:spPr>
+                </pic:pic>
+              </a:graphicData>
+            </a:graphic>
+          </wp:inline>
+        </w:drawing>
+      </w:r>
+    </w:p>
+    <w:p>
+      <w:pPr>
+        <w:spacing w:after="240"/>
+        <w:jc w:val="center"/>
+      </w:pPr>
+      <w:r>
+        <w:rPr>
+          <w:i/>
+          <w:color w:val="64748B"/>
+          <w:sz w:val="19"/>
+        </w:rPr>
+        <w:t>Figure: Geographic Map of Indian Tourist Destinations &amp; Visitor Footfall Density</w:t>
+      </w:r>
+    </w:p>
+    <w:p>
+      <w:pPr>
+        <w:spacing w:before="160" w:after="80"/>
+        <w:jc w:val="center"/>
+      </w:pPr>
+      <w:r>
+        <w:drawing>
+          <wp:inline xmlns:a="http://schemas.openxmlformats.org/drawingml/2006/main" xmlns:pic="http://schemas.openxmlformats.org/drawingml/2006/picture">
             <wp:extent cx="5486400" cy="1371600"/>
-            <wp:docPr id="1" name="Picture 1"/>
+            <wp:docPr id="2" name="Picture 2"/>
             <wp:cNvGraphicFramePr>
               <a:graphicFrameLocks noChangeAspect="1"/>
             </wp:cNvGraphicFramePr>
@@ -409,7 +463,7 @@
                     <pic:cNvPicPr/>
                   </pic:nvPicPr>
                   <pic:blipFill>
-                    <a:blip r:embed="rId9"/>
+                    <a:blip r:embed="rId10"/>
                     <a:stretch>
                       <a:fillRect/>
                     </a:stretch>
@@ -451,7 +505,7 @@
         <w:drawing>
           <wp:inline xmlns:a="http://schemas.openxmlformats.org/drawingml/2006/main" xmlns:pic="http://schemas.openxmlformats.org/drawingml/2006/picture">
             <wp:extent cx="5486400" cy="2743200"/>
-            <wp:docPr id="2" name="Picture 2"/>
+            <wp:docPr id="3" name="Picture 3"/>
             <wp:cNvGraphicFramePr>
               <a:graphicFrameLocks noChangeAspect="1"/>
             </wp:cNvGraphicFramePr>
@@ -463,7 +517,7 @@
                     <pic:cNvPicPr/>
                   </pic:nvPicPr>
                   <pic:blipFill>
-                    <a:blip r:embed="rId10"/>
+                    <a:blip r:embed="rId11"/>
                     <a:stretch>
                       <a:fillRect/>
                     </a:stretch>
@@ -532,7 +586,7 @@
         <w:drawing>
           <wp:inline xmlns:a="http://schemas.openxmlformats.org/drawingml/2006/main" xmlns:pic="http://schemas.openxmlformats.org/drawingml/2006/picture">
             <wp:extent cx="5486400" cy="2743200"/>
-            <wp:docPr id="3" name="Picture 3"/>
+            <wp:docPr id="4" name="Picture 4"/>
             <wp:cNvGraphicFramePr>
               <a:graphicFrameLocks noChangeAspect="1"/>
             </wp:cNvGraphicFramePr>
@@ -544,7 +598,7 @@
                     <pic:cNvPicPr/>
                   </pic:nvPicPr>
                   <pic:blipFill>
-                    <a:blip r:embed="rId11"/>
+                    <a:blip r:embed="rId12"/>
                     <a:stretch>
                       <a:fillRect/>
                     </a:stretch>
@@ -586,7 +640,7 @@
         <w:drawing>
           <wp:inline xmlns:a="http://schemas.openxmlformats.org/drawingml/2006/main" xmlns:pic="http://schemas.openxmlformats.org/drawingml/2006/picture">
             <wp:extent cx="5486400" cy="3048000"/>
-            <wp:docPr id="4" name="Picture 4"/>
+            <wp:docPr id="5" name="Picture 5"/>
             <wp:cNvGraphicFramePr>
               <a:graphicFrameLocks noChangeAspect="1"/>
             </wp:cNvGraphicFramePr>
@@ -598,7 +652,7 @@
                     <pic:cNvPicPr/>
                   </pic:nvPicPr>
                   <pic:blipFill>
-                    <a:blip r:embed="rId12"/>
+                    <a:blip r:embed="rId13"/>
                     <a:stretch>
                       <a:fillRect/>
                     </a:stretch>
@@ -640,7 +694,7 @@
         <w:drawing>
           <wp:inline xmlns:a="http://schemas.openxmlformats.org/drawingml/2006/main" xmlns:pic="http://schemas.openxmlformats.org/drawingml/2006/picture">
             <wp:extent cx="5486400" cy="2743200"/>
-            <wp:docPr id="5" name="Picture 5"/>
+            <wp:docPr id="6" name="Picture 6"/>
             <wp:cNvGraphicFramePr>
               <a:graphicFrameLocks noChangeAspect="1"/>
             </wp:cNvGraphicFramePr>
@@ -652,7 +706,7 @@
                     <pic:cNvPicPr/>
                   </pic:nvPicPr>
                   <pic:blipFill>
-                    <a:blip r:embed="rId13"/>
+                    <a:blip r:embed="rId14"/>
                     <a:stretch>
                       <a:fillRect/>
                     </a:stretch>

</xml_diff>